<commit_message>
docs: Quadro 21 com Opus 5 e 5.5 em todas as linhas e lista do que os autores devem revisar antes de submeter
Co-Authored-By: Claude Opus 5.5 <noreply@anthropic.com>
</commit_message>
<xml_diff>
--- a/Transicao_pre-projeto-para-TCC-Completo_TCC_Iluminacao_SP_v6.docx
+++ b/Transicao_pre-projeto-para-TCC-Completo_TCC_Iluminacao_SP_v6.docx
@@ -1368,7 +1368,7 @@
           <w:r>
             <w:fldChar w:fldCharType="separate"/>
           </w:r>
-          <w:hyperlink w:anchor="_Toc241705315" w:history="1">
+          <w:hyperlink w:anchor="_Toc241705798" w:history="1">
             <w:r>
               <w:rPr>
                 <w:rStyle w:val="Hyperlink"/>
@@ -1396,7 +1396,7 @@
                 <w:noProof/>
                 <w:webHidden/>
               </w:rPr>
-              <w:instrText xml:space="preserve"> PAGEREF _Toc241705315 \h </w:instrText>
+              <w:instrText xml:space="preserve"> PAGEREF _Toc241705798 \h </w:instrText>
             </w:r>
             <w:r>
               <w:rPr>
@@ -1441,7 +1441,7 @@
               <w14:ligatures w14:val="standardContextual"/>
             </w:rPr>
           </w:pPr>
-          <w:hyperlink w:anchor="_Toc241705316" w:history="1">
+          <w:hyperlink w:anchor="_Toc241705799" w:history="1">
             <w:r>
               <w:rPr>
                 <w:rStyle w:val="Hyperlink"/>
@@ -1469,7 +1469,7 @@
                 <w:noProof/>
                 <w:webHidden/>
               </w:rPr>
-              <w:instrText xml:space="preserve"> PAGEREF _Toc241705316 \h </w:instrText>
+              <w:instrText xml:space="preserve"> PAGEREF _Toc241705799 \h </w:instrText>
             </w:r>
             <w:r>
               <w:rPr>
@@ -1514,7 +1514,7 @@
               <w14:ligatures w14:val="standardContextual"/>
             </w:rPr>
           </w:pPr>
-          <w:hyperlink w:anchor="_Toc241705317" w:history="1">
+          <w:hyperlink w:anchor="_Toc241705800" w:history="1">
             <w:r>
               <w:rPr>
                 <w:rStyle w:val="Hyperlink"/>
@@ -1542,7 +1542,7 @@
                 <w:noProof/>
                 <w:webHidden/>
               </w:rPr>
-              <w:instrText xml:space="preserve"> PAGEREF _Toc241705317 \h </w:instrText>
+              <w:instrText xml:space="preserve"> PAGEREF _Toc241705800 \h </w:instrText>
             </w:r>
             <w:r>
               <w:rPr>
@@ -1587,7 +1587,7 @@
               <w14:ligatures w14:val="standardContextual"/>
             </w:rPr>
           </w:pPr>
-          <w:hyperlink w:anchor="_Toc241705318" w:history="1">
+          <w:hyperlink w:anchor="_Toc241705801" w:history="1">
             <w:r>
               <w:rPr>
                 <w:rStyle w:val="Hyperlink"/>
@@ -1615,7 +1615,7 @@
                 <w:noProof/>
                 <w:webHidden/>
               </w:rPr>
-              <w:instrText xml:space="preserve"> PAGEREF _Toc241705318 \h </w:instrText>
+              <w:instrText xml:space="preserve"> PAGEREF _Toc241705801 \h </w:instrText>
             </w:r>
             <w:r>
               <w:rPr>
@@ -1660,7 +1660,7 @@
               <w14:ligatures w14:val="standardContextual"/>
             </w:rPr>
           </w:pPr>
-          <w:hyperlink w:anchor="_Toc241705319" w:history="1">
+          <w:hyperlink w:anchor="_Toc241705802" w:history="1">
             <w:r>
               <w:rPr>
                 <w:rStyle w:val="Hyperlink"/>
@@ -1688,7 +1688,7 @@
                 <w:noProof/>
                 <w:webHidden/>
               </w:rPr>
-              <w:instrText xml:space="preserve"> PAGEREF _Toc241705319 \h </w:instrText>
+              <w:instrText xml:space="preserve"> PAGEREF _Toc241705802 \h </w:instrText>
             </w:r>
             <w:r>
               <w:rPr>
@@ -1733,7 +1733,7 @@
               <w14:ligatures w14:val="standardContextual"/>
             </w:rPr>
           </w:pPr>
-          <w:hyperlink w:anchor="_Toc241705320" w:history="1">
+          <w:hyperlink w:anchor="_Toc241705803" w:history="1">
             <w:r>
               <w:rPr>
                 <w:rStyle w:val="Hyperlink"/>
@@ -1761,7 +1761,7 @@
                 <w:noProof/>
                 <w:webHidden/>
               </w:rPr>
-              <w:instrText xml:space="preserve"> PAGEREF _Toc241705320 \h </w:instrText>
+              <w:instrText xml:space="preserve"> PAGEREF _Toc241705803 \h </w:instrText>
             </w:r>
             <w:r>
               <w:rPr>
@@ -1806,7 +1806,7 @@
               <w14:ligatures w14:val="standardContextual"/>
             </w:rPr>
           </w:pPr>
-          <w:hyperlink w:anchor="_Toc241705321" w:history="1">
+          <w:hyperlink w:anchor="_Toc241705804" w:history="1">
             <w:r>
               <w:rPr>
                 <w:rStyle w:val="Hyperlink"/>
@@ -1834,7 +1834,7 @@
                 <w:noProof/>
                 <w:webHidden/>
               </w:rPr>
-              <w:instrText xml:space="preserve"> PAGEREF _Toc241705321 \h </w:instrText>
+              <w:instrText xml:space="preserve"> PAGEREF _Toc241705804 \h </w:instrText>
             </w:r>
             <w:r>
               <w:rPr>
@@ -1879,7 +1879,7 @@
               <w14:ligatures w14:val="standardContextual"/>
             </w:rPr>
           </w:pPr>
-          <w:hyperlink w:anchor="_Toc241705322" w:history="1">
+          <w:hyperlink w:anchor="_Toc241705805" w:history="1">
             <w:r>
               <w:rPr>
                 <w:rStyle w:val="Hyperlink"/>
@@ -1907,7 +1907,7 @@
                 <w:noProof/>
                 <w:webHidden/>
               </w:rPr>
-              <w:instrText xml:space="preserve"> PAGEREF _Toc241705322 \h </w:instrText>
+              <w:instrText xml:space="preserve"> PAGEREF _Toc241705805 \h </w:instrText>
             </w:r>
             <w:r>
               <w:rPr>
@@ -1952,7 +1952,7 @@
               <w14:ligatures w14:val="standardContextual"/>
             </w:rPr>
           </w:pPr>
-          <w:hyperlink w:anchor="_Toc241705323" w:history="1">
+          <w:hyperlink w:anchor="_Toc241705806" w:history="1">
             <w:r>
               <w:rPr>
                 <w:rStyle w:val="Hyperlink"/>
@@ -1980,7 +1980,7 @@
                 <w:noProof/>
                 <w:webHidden/>
               </w:rPr>
-              <w:instrText xml:space="preserve"> PAGEREF _Toc241705323 \h </w:instrText>
+              <w:instrText xml:space="preserve"> PAGEREF _Toc241705806 \h </w:instrText>
             </w:r>
             <w:r>
               <w:rPr>
@@ -2025,7 +2025,7 @@
               <w14:ligatures w14:val="standardContextual"/>
             </w:rPr>
           </w:pPr>
-          <w:hyperlink w:anchor="_Toc241705324" w:history="1">
+          <w:hyperlink w:anchor="_Toc241705807" w:history="1">
             <w:r>
               <w:rPr>
                 <w:rStyle w:val="Hyperlink"/>
@@ -2053,7 +2053,7 @@
                 <w:noProof/>
                 <w:webHidden/>
               </w:rPr>
-              <w:instrText xml:space="preserve"> PAGEREF _Toc241705324 \h </w:instrText>
+              <w:instrText xml:space="preserve"> PAGEREF _Toc241705807 \h </w:instrText>
             </w:r>
             <w:r>
               <w:rPr>
@@ -2098,7 +2098,7 @@
               <w14:ligatures w14:val="standardContextual"/>
             </w:rPr>
           </w:pPr>
-          <w:hyperlink w:anchor="_Toc241705325" w:history="1">
+          <w:hyperlink w:anchor="_Toc241705808" w:history="1">
             <w:r>
               <w:rPr>
                 <w:rStyle w:val="Hyperlink"/>
@@ -2126,7 +2126,7 @@
                 <w:noProof/>
                 <w:webHidden/>
               </w:rPr>
-              <w:instrText xml:space="preserve"> PAGEREF _Toc241705325 \h </w:instrText>
+              <w:instrText xml:space="preserve"> PAGEREF _Toc241705808 \h </w:instrText>
             </w:r>
             <w:r>
               <w:rPr>
@@ -2171,7 +2171,7 @@
               <w14:ligatures w14:val="standardContextual"/>
             </w:rPr>
           </w:pPr>
-          <w:hyperlink w:anchor="_Toc241705326" w:history="1">
+          <w:hyperlink w:anchor="_Toc241705809" w:history="1">
             <w:r>
               <w:rPr>
                 <w:rStyle w:val="Hyperlink"/>
@@ -2199,7 +2199,7 @@
                 <w:noProof/>
                 <w:webHidden/>
               </w:rPr>
-              <w:instrText xml:space="preserve"> PAGEREF _Toc241705326 \h </w:instrText>
+              <w:instrText xml:space="preserve"> PAGEREF _Toc241705809 \h </w:instrText>
             </w:r>
             <w:r>
               <w:rPr>
@@ -2244,7 +2244,7 @@
               <w14:ligatures w14:val="standardContextual"/>
             </w:rPr>
           </w:pPr>
-          <w:hyperlink w:anchor="_Toc241705327" w:history="1">
+          <w:hyperlink w:anchor="_Toc241705810" w:history="1">
             <w:r>
               <w:rPr>
                 <w:rStyle w:val="Hyperlink"/>
@@ -2272,7 +2272,7 @@
                 <w:noProof/>
                 <w:webHidden/>
               </w:rPr>
-              <w:instrText xml:space="preserve"> PAGEREF _Toc241705327 \h </w:instrText>
+              <w:instrText xml:space="preserve"> PAGEREF _Toc241705810 \h </w:instrText>
             </w:r>
             <w:r>
               <w:rPr>
@@ -2319,7 +2319,7 @@
               <w14:ligatures w14:val="standardContextual"/>
             </w:rPr>
           </w:pPr>
-          <w:hyperlink w:anchor="_Toc241705328" w:history="1">
+          <w:hyperlink w:anchor="_Toc241705811" w:history="1">
             <w:r>
               <w:rPr>
                 <w:rStyle w:val="Hyperlink"/>
@@ -2347,7 +2347,7 @@
                 <w:noProof/>
                 <w:webHidden/>
               </w:rPr>
-              <w:instrText xml:space="preserve"> PAGEREF _Toc241705328 \h </w:instrText>
+              <w:instrText xml:space="preserve"> PAGEREF _Toc241705811 \h </w:instrText>
             </w:r>
             <w:r>
               <w:rPr>
@@ -2392,7 +2392,7 @@
               <w14:ligatures w14:val="standardContextual"/>
             </w:rPr>
           </w:pPr>
-          <w:hyperlink w:anchor="_Toc241705329" w:history="1">
+          <w:hyperlink w:anchor="_Toc241705812" w:history="1">
             <w:r>
               <w:rPr>
                 <w:rStyle w:val="Hyperlink"/>
@@ -2420,7 +2420,7 @@
                 <w:noProof/>
                 <w:webHidden/>
               </w:rPr>
-              <w:instrText xml:space="preserve"> PAGEREF _Toc241705329 \h </w:instrText>
+              <w:instrText xml:space="preserve"> PAGEREF _Toc241705812 \h </w:instrText>
             </w:r>
             <w:r>
               <w:rPr>
@@ -2465,7 +2465,7 @@
               <w14:ligatures w14:val="standardContextual"/>
             </w:rPr>
           </w:pPr>
-          <w:hyperlink w:anchor="_Toc241705330" w:history="1">
+          <w:hyperlink w:anchor="_Toc241705813" w:history="1">
             <w:r>
               <w:rPr>
                 <w:rStyle w:val="Hyperlink"/>
@@ -2493,7 +2493,7 @@
                 <w:noProof/>
                 <w:webHidden/>
               </w:rPr>
-              <w:instrText xml:space="preserve"> PAGEREF _Toc241705330 \h </w:instrText>
+              <w:instrText xml:space="preserve"> PAGEREF _Toc241705813 \h </w:instrText>
             </w:r>
             <w:r>
               <w:rPr>
@@ -2538,7 +2538,7 @@
               <w14:ligatures w14:val="standardContextual"/>
             </w:rPr>
           </w:pPr>
-          <w:hyperlink w:anchor="_Toc241705331" w:history="1">
+          <w:hyperlink w:anchor="_Toc241705814" w:history="1">
             <w:r>
               <w:rPr>
                 <w:rStyle w:val="Hyperlink"/>
@@ -2566,7 +2566,7 @@
                 <w:noProof/>
                 <w:webHidden/>
               </w:rPr>
-              <w:instrText xml:space="preserve"> PAGEREF _Toc241705331 \h </w:instrText>
+              <w:instrText xml:space="preserve"> PAGEREF _Toc241705814 \h </w:instrText>
             </w:r>
             <w:r>
               <w:rPr>
@@ -2611,7 +2611,7 @@
               <w14:ligatures w14:val="standardContextual"/>
             </w:rPr>
           </w:pPr>
-          <w:hyperlink w:anchor="_Toc241705332" w:history="1">
+          <w:hyperlink w:anchor="_Toc241705815" w:history="1">
             <w:r>
               <w:rPr>
                 <w:rStyle w:val="Hyperlink"/>
@@ -2639,7 +2639,7 @@
                 <w:noProof/>
                 <w:webHidden/>
               </w:rPr>
-              <w:instrText xml:space="preserve"> PAGEREF _Toc241705332 \h </w:instrText>
+              <w:instrText xml:space="preserve"> PAGEREF _Toc241705815 \h </w:instrText>
             </w:r>
             <w:r>
               <w:rPr>
@@ -2684,7 +2684,7 @@
               <w14:ligatures w14:val="standardContextual"/>
             </w:rPr>
           </w:pPr>
-          <w:hyperlink w:anchor="_Toc241705333" w:history="1">
+          <w:hyperlink w:anchor="_Toc241705816" w:history="1">
             <w:r>
               <w:rPr>
                 <w:rStyle w:val="Hyperlink"/>
@@ -2712,7 +2712,7 @@
                 <w:noProof/>
                 <w:webHidden/>
               </w:rPr>
-              <w:instrText xml:space="preserve"> PAGEREF _Toc241705333 \h </w:instrText>
+              <w:instrText xml:space="preserve"> PAGEREF _Toc241705816 \h </w:instrText>
             </w:r>
             <w:r>
               <w:rPr>
@@ -2757,7 +2757,7 @@
               <w14:ligatures w14:val="standardContextual"/>
             </w:rPr>
           </w:pPr>
-          <w:hyperlink w:anchor="_Toc241705334" w:history="1">
+          <w:hyperlink w:anchor="_Toc241705817" w:history="1">
             <w:r>
               <w:rPr>
                 <w:rStyle w:val="Hyperlink"/>
@@ -2785,7 +2785,7 @@
                 <w:noProof/>
                 <w:webHidden/>
               </w:rPr>
-              <w:instrText xml:space="preserve"> PAGEREF _Toc241705334 \h </w:instrText>
+              <w:instrText xml:space="preserve"> PAGEREF _Toc241705817 \h </w:instrText>
             </w:r>
             <w:r>
               <w:rPr>
@@ -2830,7 +2830,7 @@
               <w14:ligatures w14:val="standardContextual"/>
             </w:rPr>
           </w:pPr>
-          <w:hyperlink w:anchor="_Toc241705335" w:history="1">
+          <w:hyperlink w:anchor="_Toc241705818" w:history="1">
             <w:r>
               <w:rPr>
                 <w:rStyle w:val="Hyperlink"/>
@@ -2858,7 +2858,7 @@
                 <w:noProof/>
                 <w:webHidden/>
               </w:rPr>
-              <w:instrText xml:space="preserve"> PAGEREF _Toc241705335 \h </w:instrText>
+              <w:instrText xml:space="preserve"> PAGEREF _Toc241705818 \h </w:instrText>
             </w:r>
             <w:r>
               <w:rPr>
@@ -2903,7 +2903,7 @@
               <w14:ligatures w14:val="standardContextual"/>
             </w:rPr>
           </w:pPr>
-          <w:hyperlink w:anchor="_Toc241705336" w:history="1">
+          <w:hyperlink w:anchor="_Toc241705819" w:history="1">
             <w:r>
               <w:rPr>
                 <w:rStyle w:val="Hyperlink"/>
@@ -2931,7 +2931,7 @@
                 <w:noProof/>
                 <w:webHidden/>
               </w:rPr>
-              <w:instrText xml:space="preserve"> PAGEREF _Toc241705336 \h </w:instrText>
+              <w:instrText xml:space="preserve"> PAGEREF _Toc241705819 \h </w:instrText>
             </w:r>
             <w:r>
               <w:rPr>
@@ -2976,7 +2976,7 @@
               <w14:ligatures w14:val="standardContextual"/>
             </w:rPr>
           </w:pPr>
-          <w:hyperlink w:anchor="_Toc241705337" w:history="1">
+          <w:hyperlink w:anchor="_Toc241705820" w:history="1">
             <w:r>
               <w:rPr>
                 <w:rStyle w:val="Hyperlink"/>
@@ -3004,7 +3004,7 @@
                 <w:noProof/>
                 <w:webHidden/>
               </w:rPr>
-              <w:instrText xml:space="preserve"> PAGEREF _Toc241705337 \h </w:instrText>
+              <w:instrText xml:space="preserve"> PAGEREF _Toc241705820 \h </w:instrText>
             </w:r>
             <w:r>
               <w:rPr>
@@ -3049,7 +3049,7 @@
               <w14:ligatures w14:val="standardContextual"/>
             </w:rPr>
           </w:pPr>
-          <w:hyperlink w:anchor="_Toc241705338" w:history="1">
+          <w:hyperlink w:anchor="_Toc241705821" w:history="1">
             <w:r>
               <w:rPr>
                 <w:rStyle w:val="Hyperlink"/>
@@ -3077,7 +3077,7 @@
                 <w:noProof/>
                 <w:webHidden/>
               </w:rPr>
-              <w:instrText xml:space="preserve"> PAGEREF _Toc241705338 \h </w:instrText>
+              <w:instrText xml:space="preserve"> PAGEREF _Toc241705821 \h </w:instrText>
             </w:r>
             <w:r>
               <w:rPr>
@@ -3124,7 +3124,7 @@
               <w14:ligatures w14:val="standardContextual"/>
             </w:rPr>
           </w:pPr>
-          <w:hyperlink w:anchor="_Toc241705339" w:history="1">
+          <w:hyperlink w:anchor="_Toc241705822" w:history="1">
             <w:r>
               <w:rPr>
                 <w:rStyle w:val="Hyperlink"/>
@@ -3152,7 +3152,7 @@
                 <w:noProof/>
                 <w:webHidden/>
               </w:rPr>
-              <w:instrText xml:space="preserve"> PAGEREF _Toc241705339 \h </w:instrText>
+              <w:instrText xml:space="preserve"> PAGEREF _Toc241705822 \h </w:instrText>
             </w:r>
             <w:r>
               <w:rPr>
@@ -3197,7 +3197,7 @@
               <w14:ligatures w14:val="standardContextual"/>
             </w:rPr>
           </w:pPr>
-          <w:hyperlink w:anchor="_Toc241705340" w:history="1">
+          <w:hyperlink w:anchor="_Toc241705823" w:history="1">
             <w:r>
               <w:rPr>
                 <w:rStyle w:val="Hyperlink"/>
@@ -3225,7 +3225,7 @@
                 <w:noProof/>
                 <w:webHidden/>
               </w:rPr>
-              <w:instrText xml:space="preserve"> PAGEREF _Toc241705340 \h </w:instrText>
+              <w:instrText xml:space="preserve"> PAGEREF _Toc241705823 \h </w:instrText>
             </w:r>
             <w:r>
               <w:rPr>
@@ -3270,7 +3270,7 @@
               <w14:ligatures w14:val="standardContextual"/>
             </w:rPr>
           </w:pPr>
-          <w:hyperlink w:anchor="_Toc241705341" w:history="1">
+          <w:hyperlink w:anchor="_Toc241705824" w:history="1">
             <w:r>
               <w:rPr>
                 <w:rStyle w:val="Hyperlink"/>
@@ -3298,7 +3298,7 @@
                 <w:noProof/>
                 <w:webHidden/>
               </w:rPr>
-              <w:instrText xml:space="preserve"> PAGEREF _Toc241705341 \h </w:instrText>
+              <w:instrText xml:space="preserve"> PAGEREF _Toc241705824 \h </w:instrText>
             </w:r>
             <w:r>
               <w:rPr>
@@ -3343,7 +3343,7 @@
               <w14:ligatures w14:val="standardContextual"/>
             </w:rPr>
           </w:pPr>
-          <w:hyperlink w:anchor="_Toc241705342" w:history="1">
+          <w:hyperlink w:anchor="_Toc241705825" w:history="1">
             <w:r>
               <w:rPr>
                 <w:rStyle w:val="Hyperlink"/>
@@ -3371,7 +3371,7 @@
                 <w:noProof/>
                 <w:webHidden/>
               </w:rPr>
-              <w:instrText xml:space="preserve"> PAGEREF _Toc241705342 \h </w:instrText>
+              <w:instrText xml:space="preserve"> PAGEREF _Toc241705825 \h </w:instrText>
             </w:r>
             <w:r>
               <w:rPr>
@@ -3416,7 +3416,7 @@
               <w14:ligatures w14:val="standardContextual"/>
             </w:rPr>
           </w:pPr>
-          <w:hyperlink w:anchor="_Toc241705343" w:history="1">
+          <w:hyperlink w:anchor="_Toc241705826" w:history="1">
             <w:r>
               <w:rPr>
                 <w:rStyle w:val="Hyperlink"/>
@@ -3444,7 +3444,7 @@
                 <w:noProof/>
                 <w:webHidden/>
               </w:rPr>
-              <w:instrText xml:space="preserve"> PAGEREF _Toc241705343 \h </w:instrText>
+              <w:instrText xml:space="preserve"> PAGEREF _Toc241705826 \h </w:instrText>
             </w:r>
             <w:r>
               <w:rPr>
@@ -3489,7 +3489,7 @@
               <w14:ligatures w14:val="standardContextual"/>
             </w:rPr>
           </w:pPr>
-          <w:hyperlink w:anchor="_Toc241705344" w:history="1">
+          <w:hyperlink w:anchor="_Toc241705827" w:history="1">
             <w:r>
               <w:rPr>
                 <w:rStyle w:val="Hyperlink"/>
@@ -3517,7 +3517,7 @@
                 <w:noProof/>
                 <w:webHidden/>
               </w:rPr>
-              <w:instrText xml:space="preserve"> PAGEREF _Toc241705344 \h </w:instrText>
+              <w:instrText xml:space="preserve"> PAGEREF _Toc241705827 \h </w:instrText>
             </w:r>
             <w:r>
               <w:rPr>
@@ -3562,7 +3562,7 @@
               <w14:ligatures w14:val="standardContextual"/>
             </w:rPr>
           </w:pPr>
-          <w:hyperlink w:anchor="_Toc241705345" w:history="1">
+          <w:hyperlink w:anchor="_Toc241705828" w:history="1">
             <w:r>
               <w:rPr>
                 <w:rStyle w:val="Hyperlink"/>
@@ -3590,7 +3590,7 @@
                 <w:noProof/>
                 <w:webHidden/>
               </w:rPr>
-              <w:instrText xml:space="preserve"> PAGEREF _Toc241705345 \h </w:instrText>
+              <w:instrText xml:space="preserve"> PAGEREF _Toc241705828 \h </w:instrText>
             </w:r>
             <w:r>
               <w:rPr>
@@ -3635,7 +3635,7 @@
               <w14:ligatures w14:val="standardContextual"/>
             </w:rPr>
           </w:pPr>
-          <w:hyperlink w:anchor="_Toc241705346" w:history="1">
+          <w:hyperlink w:anchor="_Toc241705829" w:history="1">
             <w:r>
               <w:rPr>
                 <w:rStyle w:val="Hyperlink"/>
@@ -3663,7 +3663,7 @@
                 <w:noProof/>
                 <w:webHidden/>
               </w:rPr>
-              <w:instrText xml:space="preserve"> PAGEREF _Toc241705346 \h </w:instrText>
+              <w:instrText xml:space="preserve"> PAGEREF _Toc241705829 \h </w:instrText>
             </w:r>
             <w:r>
               <w:rPr>
@@ -3708,7 +3708,7 @@
               <w14:ligatures w14:val="standardContextual"/>
             </w:rPr>
           </w:pPr>
-          <w:hyperlink w:anchor="_Toc241705347" w:history="1">
+          <w:hyperlink w:anchor="_Toc241705830" w:history="1">
             <w:r>
               <w:rPr>
                 <w:rStyle w:val="Hyperlink"/>
@@ -3736,7 +3736,7 @@
                 <w:noProof/>
                 <w:webHidden/>
               </w:rPr>
-              <w:instrText xml:space="preserve"> PAGEREF _Toc241705347 \h </w:instrText>
+              <w:instrText xml:space="preserve"> PAGEREF _Toc241705830 \h </w:instrText>
             </w:r>
             <w:r>
               <w:rPr>
@@ -3781,7 +3781,7 @@
               <w14:ligatures w14:val="standardContextual"/>
             </w:rPr>
           </w:pPr>
-          <w:hyperlink w:anchor="_Toc241705348" w:history="1">
+          <w:hyperlink w:anchor="_Toc241705831" w:history="1">
             <w:r>
               <w:rPr>
                 <w:rStyle w:val="Hyperlink"/>
@@ -3809,7 +3809,7 @@
                 <w:noProof/>
                 <w:webHidden/>
               </w:rPr>
-              <w:instrText xml:space="preserve"> PAGEREF _Toc241705348 \h </w:instrText>
+              <w:instrText xml:space="preserve"> PAGEREF _Toc241705831 \h </w:instrText>
             </w:r>
             <w:r>
               <w:rPr>
@@ -3854,7 +3854,7 @@
               <w14:ligatures w14:val="standardContextual"/>
             </w:rPr>
           </w:pPr>
-          <w:hyperlink w:anchor="_Toc241705349" w:history="1">
+          <w:hyperlink w:anchor="_Toc241705832" w:history="1">
             <w:r>
               <w:rPr>
                 <w:rStyle w:val="Hyperlink"/>
@@ -3882,7 +3882,7 @@
                 <w:noProof/>
                 <w:webHidden/>
               </w:rPr>
-              <w:instrText xml:space="preserve"> PAGEREF _Toc241705349 \h </w:instrText>
+              <w:instrText xml:space="preserve"> PAGEREF _Toc241705832 \h </w:instrText>
             </w:r>
             <w:r>
               <w:rPr>
@@ -3927,7 +3927,7 @@
               <w14:ligatures w14:val="standardContextual"/>
             </w:rPr>
           </w:pPr>
-          <w:hyperlink w:anchor="_Toc241705350" w:history="1">
+          <w:hyperlink w:anchor="_Toc241705833" w:history="1">
             <w:r>
               <w:rPr>
                 <w:rStyle w:val="Hyperlink"/>
@@ -3955,7 +3955,7 @@
                 <w:noProof/>
                 <w:webHidden/>
               </w:rPr>
-              <w:instrText xml:space="preserve"> PAGEREF _Toc241705350 \h </w:instrText>
+              <w:instrText xml:space="preserve"> PAGEREF _Toc241705833 \h </w:instrText>
             </w:r>
             <w:r>
               <w:rPr>
@@ -4000,7 +4000,7 @@
               <w14:ligatures w14:val="standardContextual"/>
             </w:rPr>
           </w:pPr>
-          <w:hyperlink w:anchor="_Toc241705351" w:history="1">
+          <w:hyperlink w:anchor="_Toc241705834" w:history="1">
             <w:r>
               <w:rPr>
                 <w:rStyle w:val="Hyperlink"/>
@@ -4028,7 +4028,7 @@
                 <w:noProof/>
                 <w:webHidden/>
               </w:rPr>
-              <w:instrText xml:space="preserve"> PAGEREF _Toc241705351 \h </w:instrText>
+              <w:instrText xml:space="preserve"> PAGEREF _Toc241705834 \h </w:instrText>
             </w:r>
             <w:r>
               <w:rPr>
@@ -4073,7 +4073,7 @@
               <w14:ligatures w14:val="standardContextual"/>
             </w:rPr>
           </w:pPr>
-          <w:hyperlink w:anchor="_Toc241705352" w:history="1">
+          <w:hyperlink w:anchor="_Toc241705835" w:history="1">
             <w:r>
               <w:rPr>
                 <w:rStyle w:val="Hyperlink"/>
@@ -4101,7 +4101,7 @@
                 <w:noProof/>
                 <w:webHidden/>
               </w:rPr>
-              <w:instrText xml:space="preserve"> PAGEREF _Toc241705352 \h </w:instrText>
+              <w:instrText xml:space="preserve"> PAGEREF _Toc241705835 \h </w:instrText>
             </w:r>
             <w:r>
               <w:rPr>
@@ -4146,7 +4146,7 @@
               <w14:ligatures w14:val="standardContextual"/>
             </w:rPr>
           </w:pPr>
-          <w:hyperlink w:anchor="_Toc241705353" w:history="1">
+          <w:hyperlink w:anchor="_Toc241705836" w:history="1">
             <w:r>
               <w:rPr>
                 <w:rStyle w:val="Hyperlink"/>
@@ -4174,7 +4174,7 @@
                 <w:noProof/>
                 <w:webHidden/>
               </w:rPr>
-              <w:instrText xml:space="preserve"> PAGEREF _Toc241705353 \h </w:instrText>
+              <w:instrText xml:space="preserve"> PAGEREF _Toc241705836 \h </w:instrText>
             </w:r>
             <w:r>
               <w:rPr>
@@ -4219,7 +4219,7 @@
               <w14:ligatures w14:val="standardContextual"/>
             </w:rPr>
           </w:pPr>
-          <w:hyperlink w:anchor="_Toc241705354" w:history="1">
+          <w:hyperlink w:anchor="_Toc241705837" w:history="1">
             <w:r>
               <w:rPr>
                 <w:rStyle w:val="Hyperlink"/>
@@ -4247,7 +4247,7 @@
                 <w:noProof/>
                 <w:webHidden/>
               </w:rPr>
-              <w:instrText xml:space="preserve"> PAGEREF _Toc241705354 \h </w:instrText>
+              <w:instrText xml:space="preserve"> PAGEREF _Toc241705837 \h </w:instrText>
             </w:r>
             <w:r>
               <w:rPr>
@@ -4292,7 +4292,7 @@
               <w14:ligatures w14:val="standardContextual"/>
             </w:rPr>
           </w:pPr>
-          <w:hyperlink w:anchor="_Toc241705355" w:history="1">
+          <w:hyperlink w:anchor="_Toc241705838" w:history="1">
             <w:r>
               <w:rPr>
                 <w:rStyle w:val="Hyperlink"/>
@@ -4320,7 +4320,7 @@
                 <w:noProof/>
                 <w:webHidden/>
               </w:rPr>
-              <w:instrText xml:space="preserve"> PAGEREF _Toc241705355 \h </w:instrText>
+              <w:instrText xml:space="preserve"> PAGEREF _Toc241705838 \h </w:instrText>
             </w:r>
             <w:r>
               <w:rPr>
@@ -4365,7 +4365,7 @@
               <w14:ligatures w14:val="standardContextual"/>
             </w:rPr>
           </w:pPr>
-          <w:hyperlink w:anchor="_Toc241705356" w:history="1">
+          <w:hyperlink w:anchor="_Toc241705839" w:history="1">
             <w:r>
               <w:rPr>
                 <w:rStyle w:val="Hyperlink"/>
@@ -4393,7 +4393,7 @@
                 <w:noProof/>
                 <w:webHidden/>
               </w:rPr>
-              <w:instrText xml:space="preserve"> PAGEREF _Toc241705356 \h </w:instrText>
+              <w:instrText xml:space="preserve"> PAGEREF _Toc241705839 \h </w:instrText>
             </w:r>
             <w:r>
               <w:rPr>
@@ -4438,7 +4438,7 @@
               <w14:ligatures w14:val="standardContextual"/>
             </w:rPr>
           </w:pPr>
-          <w:hyperlink w:anchor="_Toc241705357" w:history="1">
+          <w:hyperlink w:anchor="_Toc241705840" w:history="1">
             <w:r>
               <w:rPr>
                 <w:rStyle w:val="Hyperlink"/>
@@ -4466,7 +4466,7 @@
                 <w:noProof/>
                 <w:webHidden/>
               </w:rPr>
-              <w:instrText xml:space="preserve"> PAGEREF _Toc241705357 \h </w:instrText>
+              <w:instrText xml:space="preserve"> PAGEREF _Toc241705840 \h </w:instrText>
             </w:r>
             <w:r>
               <w:rPr>
@@ -4513,7 +4513,7 @@
               <w14:ligatures w14:val="standardContextual"/>
             </w:rPr>
           </w:pPr>
-          <w:hyperlink w:anchor="_Toc241705358" w:history="1">
+          <w:hyperlink w:anchor="_Toc241705841" w:history="1">
             <w:r>
               <w:rPr>
                 <w:rStyle w:val="Hyperlink"/>
@@ -4541,7 +4541,7 @@
                 <w:noProof/>
                 <w:webHidden/>
               </w:rPr>
-              <w:instrText xml:space="preserve"> PAGEREF _Toc241705358 \h </w:instrText>
+              <w:instrText xml:space="preserve"> PAGEREF _Toc241705841 \h </w:instrText>
             </w:r>
             <w:r>
               <w:rPr>
@@ -4586,7 +4586,7 @@
               <w14:ligatures w14:val="standardContextual"/>
             </w:rPr>
           </w:pPr>
-          <w:hyperlink w:anchor="_Toc241705359" w:history="1">
+          <w:hyperlink w:anchor="_Toc241705842" w:history="1">
             <w:r>
               <w:rPr>
                 <w:rStyle w:val="Hyperlink"/>
@@ -4614,7 +4614,7 @@
                 <w:noProof/>
                 <w:webHidden/>
               </w:rPr>
-              <w:instrText xml:space="preserve"> PAGEREF _Toc241705359 \h </w:instrText>
+              <w:instrText xml:space="preserve"> PAGEREF _Toc241705842 \h </w:instrText>
             </w:r>
             <w:r>
               <w:rPr>
@@ -4659,7 +4659,7 @@
               <w14:ligatures w14:val="standardContextual"/>
             </w:rPr>
           </w:pPr>
-          <w:hyperlink w:anchor="_Toc241705360" w:history="1">
+          <w:hyperlink w:anchor="_Toc241705843" w:history="1">
             <w:r>
               <w:rPr>
                 <w:rStyle w:val="Hyperlink"/>
@@ -4687,7 +4687,7 @@
                 <w:noProof/>
                 <w:webHidden/>
               </w:rPr>
-              <w:instrText xml:space="preserve"> PAGEREF _Toc241705360 \h </w:instrText>
+              <w:instrText xml:space="preserve"> PAGEREF _Toc241705843 \h </w:instrText>
             </w:r>
             <w:r>
               <w:rPr>
@@ -4732,7 +4732,7 @@
               <w14:ligatures w14:val="standardContextual"/>
             </w:rPr>
           </w:pPr>
-          <w:hyperlink w:anchor="_Toc241705361" w:history="1">
+          <w:hyperlink w:anchor="_Toc241705844" w:history="1">
             <w:r>
               <w:rPr>
                 <w:rStyle w:val="Hyperlink"/>
@@ -4760,7 +4760,7 @@
                 <w:noProof/>
                 <w:webHidden/>
               </w:rPr>
-              <w:instrText xml:space="preserve"> PAGEREF _Toc241705361 \h </w:instrText>
+              <w:instrText xml:space="preserve"> PAGEREF _Toc241705844 \h </w:instrText>
             </w:r>
             <w:r>
               <w:rPr>
@@ -4805,7 +4805,7 @@
               <w14:ligatures w14:val="standardContextual"/>
             </w:rPr>
           </w:pPr>
-          <w:hyperlink w:anchor="_Toc241705362" w:history="1">
+          <w:hyperlink w:anchor="_Toc241705845" w:history="1">
             <w:r>
               <w:rPr>
                 <w:rStyle w:val="Hyperlink"/>
@@ -4833,7 +4833,7 @@
                 <w:noProof/>
                 <w:webHidden/>
               </w:rPr>
-              <w:instrText xml:space="preserve"> PAGEREF _Toc241705362 \h </w:instrText>
+              <w:instrText xml:space="preserve"> PAGEREF _Toc241705845 \h </w:instrText>
             </w:r>
             <w:r>
               <w:rPr>
@@ -4878,7 +4878,7 @@
               <w14:ligatures w14:val="standardContextual"/>
             </w:rPr>
           </w:pPr>
-          <w:hyperlink w:anchor="_Toc241705363" w:history="1">
+          <w:hyperlink w:anchor="_Toc241705846" w:history="1">
             <w:r>
               <w:rPr>
                 <w:rStyle w:val="Hyperlink"/>
@@ -4906,7 +4906,7 @@
                 <w:noProof/>
                 <w:webHidden/>
               </w:rPr>
-              <w:instrText xml:space="preserve"> PAGEREF _Toc241705363 \h </w:instrText>
+              <w:instrText xml:space="preserve"> PAGEREF _Toc241705846 \h </w:instrText>
             </w:r>
             <w:r>
               <w:rPr>
@@ -4951,7 +4951,7 @@
               <w14:ligatures w14:val="standardContextual"/>
             </w:rPr>
           </w:pPr>
-          <w:hyperlink w:anchor="_Toc241705364" w:history="1">
+          <w:hyperlink w:anchor="_Toc241705847" w:history="1">
             <w:r>
               <w:rPr>
                 <w:rStyle w:val="Hyperlink"/>
@@ -4979,7 +4979,7 @@
                 <w:noProof/>
                 <w:webHidden/>
               </w:rPr>
-              <w:instrText xml:space="preserve"> PAGEREF _Toc241705364 \h </w:instrText>
+              <w:instrText xml:space="preserve"> PAGEREF _Toc241705847 \h </w:instrText>
             </w:r>
             <w:r>
               <w:rPr>
@@ -5024,7 +5024,7 @@
               <w14:ligatures w14:val="standardContextual"/>
             </w:rPr>
           </w:pPr>
-          <w:hyperlink w:anchor="_Toc241705365" w:history="1">
+          <w:hyperlink w:anchor="_Toc241705848" w:history="1">
             <w:r>
               <w:rPr>
                 <w:rStyle w:val="Hyperlink"/>
@@ -5052,7 +5052,7 @@
                 <w:noProof/>
                 <w:webHidden/>
               </w:rPr>
-              <w:instrText xml:space="preserve"> PAGEREF _Toc241705365 \h </w:instrText>
+              <w:instrText xml:space="preserve"> PAGEREF _Toc241705848 \h </w:instrText>
             </w:r>
             <w:r>
               <w:rPr>
@@ -5097,7 +5097,7 @@
               <w14:ligatures w14:val="standardContextual"/>
             </w:rPr>
           </w:pPr>
-          <w:hyperlink w:anchor="_Toc241705366" w:history="1">
+          <w:hyperlink w:anchor="_Toc241705849" w:history="1">
             <w:r>
               <w:rPr>
                 <w:rStyle w:val="Hyperlink"/>
@@ -5125,7 +5125,7 @@
                 <w:noProof/>
                 <w:webHidden/>
               </w:rPr>
-              <w:instrText xml:space="preserve"> PAGEREF _Toc241705366 \h </w:instrText>
+              <w:instrText xml:space="preserve"> PAGEREF _Toc241705849 \h </w:instrText>
             </w:r>
             <w:r>
               <w:rPr>
@@ -5170,7 +5170,7 @@
               <w14:ligatures w14:val="standardContextual"/>
             </w:rPr>
           </w:pPr>
-          <w:hyperlink w:anchor="_Toc241705367" w:history="1">
+          <w:hyperlink w:anchor="_Toc241705850" w:history="1">
             <w:r>
               <w:rPr>
                 <w:rStyle w:val="Hyperlink"/>
@@ -5198,7 +5198,7 @@
                 <w:noProof/>
                 <w:webHidden/>
               </w:rPr>
-              <w:instrText xml:space="preserve"> PAGEREF _Toc241705367 \h </w:instrText>
+              <w:instrText xml:space="preserve"> PAGEREF _Toc241705850 \h </w:instrText>
             </w:r>
             <w:r>
               <w:rPr>
@@ -5243,7 +5243,7 @@
               <w14:ligatures w14:val="standardContextual"/>
             </w:rPr>
           </w:pPr>
-          <w:hyperlink w:anchor="_Toc241705368" w:history="1">
+          <w:hyperlink w:anchor="_Toc241705851" w:history="1">
             <w:r>
               <w:rPr>
                 <w:rStyle w:val="Hyperlink"/>
@@ -5271,7 +5271,7 @@
                 <w:noProof/>
                 <w:webHidden/>
               </w:rPr>
-              <w:instrText xml:space="preserve"> PAGEREF _Toc241705368 \h </w:instrText>
+              <w:instrText xml:space="preserve"> PAGEREF _Toc241705851 \h </w:instrText>
             </w:r>
             <w:r>
               <w:rPr>
@@ -5316,7 +5316,7 @@
               <w14:ligatures w14:val="standardContextual"/>
             </w:rPr>
           </w:pPr>
-          <w:hyperlink w:anchor="_Toc241705369" w:history="1">
+          <w:hyperlink w:anchor="_Toc241705852" w:history="1">
             <w:r>
               <w:rPr>
                 <w:rStyle w:val="Hyperlink"/>
@@ -5344,7 +5344,7 @@
                 <w:noProof/>
                 <w:webHidden/>
               </w:rPr>
-              <w:instrText xml:space="preserve"> PAGEREF _Toc241705369 \h </w:instrText>
+              <w:instrText xml:space="preserve"> PAGEREF _Toc241705852 \h </w:instrText>
             </w:r>
             <w:r>
               <w:rPr>
@@ -5389,7 +5389,7 @@
               <w14:ligatures w14:val="standardContextual"/>
             </w:rPr>
           </w:pPr>
-          <w:hyperlink w:anchor="_Toc241705370" w:history="1">
+          <w:hyperlink w:anchor="_Toc241705853" w:history="1">
             <w:r>
               <w:rPr>
                 <w:rStyle w:val="Hyperlink"/>
@@ -5417,7 +5417,7 @@
                 <w:noProof/>
                 <w:webHidden/>
               </w:rPr>
-              <w:instrText xml:space="preserve"> PAGEREF _Toc241705370 \h </w:instrText>
+              <w:instrText xml:space="preserve"> PAGEREF _Toc241705853 \h </w:instrText>
             </w:r>
             <w:r>
               <w:rPr>
@@ -5462,7 +5462,7 @@
               <w14:ligatures w14:val="standardContextual"/>
             </w:rPr>
           </w:pPr>
-          <w:hyperlink w:anchor="_Toc241705371" w:history="1">
+          <w:hyperlink w:anchor="_Toc241705854" w:history="1">
             <w:r>
               <w:rPr>
                 <w:rStyle w:val="Hyperlink"/>
@@ -5490,7 +5490,7 @@
                 <w:noProof/>
                 <w:webHidden/>
               </w:rPr>
-              <w:instrText xml:space="preserve"> PAGEREF _Toc241705371 \h </w:instrText>
+              <w:instrText xml:space="preserve"> PAGEREF _Toc241705854 \h </w:instrText>
             </w:r>
             <w:r>
               <w:rPr>
@@ -5535,7 +5535,7 @@
               <w14:ligatures w14:val="standardContextual"/>
             </w:rPr>
           </w:pPr>
-          <w:hyperlink w:anchor="_Toc241705372" w:history="1">
+          <w:hyperlink w:anchor="_Toc241705855" w:history="1">
             <w:r>
               <w:rPr>
                 <w:rStyle w:val="Hyperlink"/>
@@ -5563,7 +5563,7 @@
                 <w:noProof/>
                 <w:webHidden/>
               </w:rPr>
-              <w:instrText xml:space="preserve"> PAGEREF _Toc241705372 \h </w:instrText>
+              <w:instrText xml:space="preserve"> PAGEREF _Toc241705855 \h </w:instrText>
             </w:r>
             <w:r>
               <w:rPr>
@@ -5608,7 +5608,7 @@
               <w14:ligatures w14:val="standardContextual"/>
             </w:rPr>
           </w:pPr>
-          <w:hyperlink w:anchor="_Toc241705373" w:history="1">
+          <w:hyperlink w:anchor="_Toc241705856" w:history="1">
             <w:r>
               <w:rPr>
                 <w:rStyle w:val="Hyperlink"/>
@@ -5636,7 +5636,7 @@
                 <w:noProof/>
                 <w:webHidden/>
               </w:rPr>
-              <w:instrText xml:space="preserve"> PAGEREF _Toc241705373 \h </w:instrText>
+              <w:instrText xml:space="preserve"> PAGEREF _Toc241705856 \h </w:instrText>
             </w:r>
             <w:r>
               <w:rPr>
@@ -5683,7 +5683,7 @@
               <w14:ligatures w14:val="standardContextual"/>
             </w:rPr>
           </w:pPr>
-          <w:hyperlink w:anchor="_Toc241705374" w:history="1">
+          <w:hyperlink w:anchor="_Toc241705857" w:history="1">
             <w:r>
               <w:rPr>
                 <w:rStyle w:val="Hyperlink"/>
@@ -5711,7 +5711,7 @@
                 <w:noProof/>
                 <w:webHidden/>
               </w:rPr>
-              <w:instrText xml:space="preserve"> PAGEREF _Toc241705374 \h </w:instrText>
+              <w:instrText xml:space="preserve"> PAGEREF _Toc241705857 \h </w:instrText>
             </w:r>
             <w:r>
               <w:rPr>
@@ -5756,7 +5756,7 @@
               <w14:ligatures w14:val="standardContextual"/>
             </w:rPr>
           </w:pPr>
-          <w:hyperlink w:anchor="_Toc241705375" w:history="1">
+          <w:hyperlink w:anchor="_Toc241705858" w:history="1">
             <w:r>
               <w:rPr>
                 <w:rStyle w:val="Hyperlink"/>
@@ -5784,7 +5784,7 @@
                 <w:noProof/>
                 <w:webHidden/>
               </w:rPr>
-              <w:instrText xml:space="preserve"> PAGEREF _Toc241705375 \h </w:instrText>
+              <w:instrText xml:space="preserve"> PAGEREF _Toc241705858 \h </w:instrText>
             </w:r>
             <w:r>
               <w:rPr>
@@ -5829,7 +5829,7 @@
               <w14:ligatures w14:val="standardContextual"/>
             </w:rPr>
           </w:pPr>
-          <w:hyperlink w:anchor="_Toc241705376" w:history="1">
+          <w:hyperlink w:anchor="_Toc241705859" w:history="1">
             <w:r>
               <w:rPr>
                 <w:rStyle w:val="Hyperlink"/>
@@ -5857,7 +5857,7 @@
                 <w:noProof/>
                 <w:webHidden/>
               </w:rPr>
-              <w:instrText xml:space="preserve"> PAGEREF _Toc241705376 \h </w:instrText>
+              <w:instrText xml:space="preserve"> PAGEREF _Toc241705859 \h </w:instrText>
             </w:r>
             <w:r>
               <w:rPr>
@@ -5902,7 +5902,7 @@
               <w14:ligatures w14:val="standardContextual"/>
             </w:rPr>
           </w:pPr>
-          <w:hyperlink w:anchor="_Toc241705377" w:history="1">
+          <w:hyperlink w:anchor="_Toc241705860" w:history="1">
             <w:r>
               <w:rPr>
                 <w:rStyle w:val="Hyperlink"/>
@@ -5930,7 +5930,7 @@
                 <w:noProof/>
                 <w:webHidden/>
               </w:rPr>
-              <w:instrText xml:space="preserve"> PAGEREF _Toc241705377 \h </w:instrText>
+              <w:instrText xml:space="preserve"> PAGEREF _Toc241705860 \h </w:instrText>
             </w:r>
             <w:r>
               <w:rPr>
@@ -5975,7 +5975,7 @@
               <w14:ligatures w14:val="standardContextual"/>
             </w:rPr>
           </w:pPr>
-          <w:hyperlink w:anchor="_Toc241705378" w:history="1">
+          <w:hyperlink w:anchor="_Toc241705861" w:history="1">
             <w:r>
               <w:rPr>
                 <w:rStyle w:val="Hyperlink"/>
@@ -6003,7 +6003,7 @@
                 <w:noProof/>
                 <w:webHidden/>
               </w:rPr>
-              <w:instrText xml:space="preserve"> PAGEREF _Toc241705378 \h </w:instrText>
+              <w:instrText xml:space="preserve"> PAGEREF _Toc241705861 \h </w:instrText>
             </w:r>
             <w:r>
               <w:rPr>
@@ -6048,7 +6048,7 @@
               <w14:ligatures w14:val="standardContextual"/>
             </w:rPr>
           </w:pPr>
-          <w:hyperlink w:anchor="_Toc241705379" w:history="1">
+          <w:hyperlink w:anchor="_Toc241705862" w:history="1">
             <w:r>
               <w:rPr>
                 <w:rStyle w:val="Hyperlink"/>
@@ -6076,7 +6076,7 @@
                 <w:noProof/>
                 <w:webHidden/>
               </w:rPr>
-              <w:instrText xml:space="preserve"> PAGEREF _Toc241705379 \h </w:instrText>
+              <w:instrText xml:space="preserve"> PAGEREF _Toc241705862 \h </w:instrText>
             </w:r>
             <w:r>
               <w:rPr>
@@ -6121,7 +6121,7 @@
               <w14:ligatures w14:val="standardContextual"/>
             </w:rPr>
           </w:pPr>
-          <w:hyperlink w:anchor="_Toc241705380" w:history="1">
+          <w:hyperlink w:anchor="_Toc241705863" w:history="1">
             <w:r>
               <w:rPr>
                 <w:rStyle w:val="Hyperlink"/>
@@ -6149,7 +6149,7 @@
                 <w:noProof/>
                 <w:webHidden/>
               </w:rPr>
-              <w:instrText xml:space="preserve"> PAGEREF _Toc241705380 \h </w:instrText>
+              <w:instrText xml:space="preserve"> PAGEREF _Toc241705863 \h </w:instrText>
             </w:r>
             <w:r>
               <w:rPr>
@@ -6196,7 +6196,7 @@
               <w14:ligatures w14:val="standardContextual"/>
             </w:rPr>
           </w:pPr>
-          <w:hyperlink w:anchor="_Toc241705381" w:history="1">
+          <w:hyperlink w:anchor="_Toc241705864" w:history="1">
             <w:r>
               <w:rPr>
                 <w:rStyle w:val="Hyperlink"/>
@@ -6224,7 +6224,7 @@
                 <w:noProof/>
                 <w:webHidden/>
               </w:rPr>
-              <w:instrText xml:space="preserve"> PAGEREF _Toc241705381 \h </w:instrText>
+              <w:instrText xml:space="preserve"> PAGEREF _Toc241705864 \h </w:instrText>
             </w:r>
             <w:r>
               <w:rPr>
@@ -6269,7 +6269,7 @@
               <w14:ligatures w14:val="standardContextual"/>
             </w:rPr>
           </w:pPr>
-          <w:hyperlink w:anchor="_Toc241705382" w:history="1">
+          <w:hyperlink w:anchor="_Toc241705865" w:history="1">
             <w:r>
               <w:rPr>
                 <w:rStyle w:val="Hyperlink"/>
@@ -6297,7 +6297,7 @@
                 <w:noProof/>
                 <w:webHidden/>
               </w:rPr>
-              <w:instrText xml:space="preserve"> PAGEREF _Toc241705382 \h </w:instrText>
+              <w:instrText xml:space="preserve"> PAGEREF _Toc241705865 \h </w:instrText>
             </w:r>
             <w:r>
               <w:rPr>
@@ -6342,7 +6342,7 @@
               <w14:ligatures w14:val="standardContextual"/>
             </w:rPr>
           </w:pPr>
-          <w:hyperlink w:anchor="_Toc241705383" w:history="1">
+          <w:hyperlink w:anchor="_Toc241705866" w:history="1">
             <w:r>
               <w:rPr>
                 <w:rStyle w:val="Hyperlink"/>
@@ -6370,7 +6370,7 @@
                 <w:noProof/>
                 <w:webHidden/>
               </w:rPr>
-              <w:instrText xml:space="preserve"> PAGEREF _Toc241705383 \h </w:instrText>
+              <w:instrText xml:space="preserve"> PAGEREF _Toc241705866 \h </w:instrText>
             </w:r>
             <w:r>
               <w:rPr>
@@ -6415,7 +6415,7 @@
               <w14:ligatures w14:val="standardContextual"/>
             </w:rPr>
           </w:pPr>
-          <w:hyperlink w:anchor="_Toc241705384" w:history="1">
+          <w:hyperlink w:anchor="_Toc241705867" w:history="1">
             <w:r>
               <w:rPr>
                 <w:rStyle w:val="Hyperlink"/>
@@ -6443,7 +6443,7 @@
                 <w:noProof/>
                 <w:webHidden/>
               </w:rPr>
-              <w:instrText xml:space="preserve"> PAGEREF _Toc241705384 \h </w:instrText>
+              <w:instrText xml:space="preserve"> PAGEREF _Toc241705867 \h </w:instrText>
             </w:r>
             <w:r>
               <w:rPr>
@@ -6488,7 +6488,7 @@
               <w14:ligatures w14:val="standardContextual"/>
             </w:rPr>
           </w:pPr>
-          <w:hyperlink w:anchor="_Toc241705385" w:history="1">
+          <w:hyperlink w:anchor="_Toc241705868" w:history="1">
             <w:r>
               <w:rPr>
                 <w:rStyle w:val="Hyperlink"/>
@@ -6516,7 +6516,7 @@
                 <w:noProof/>
                 <w:webHidden/>
               </w:rPr>
-              <w:instrText xml:space="preserve"> PAGEREF _Toc241705385 \h </w:instrText>
+              <w:instrText xml:space="preserve"> PAGEREF _Toc241705868 \h </w:instrText>
             </w:r>
             <w:r>
               <w:rPr>
@@ -6563,7 +6563,7 @@
               <w14:ligatures w14:val="standardContextual"/>
             </w:rPr>
           </w:pPr>
-          <w:hyperlink w:anchor="_Toc241705386" w:history="1">
+          <w:hyperlink w:anchor="_Toc241705869" w:history="1">
             <w:r>
               <w:rPr>
                 <w:rStyle w:val="Hyperlink"/>
@@ -6591,7 +6591,7 @@
                 <w:noProof/>
                 <w:webHidden/>
               </w:rPr>
-              <w:instrText xml:space="preserve"> PAGEREF _Toc241705386 \h </w:instrText>
+              <w:instrText xml:space="preserve"> PAGEREF _Toc241705869 \h </w:instrText>
             </w:r>
             <w:r>
               <w:rPr>
@@ -6636,7 +6636,7 @@
               <w14:ligatures w14:val="standardContextual"/>
             </w:rPr>
           </w:pPr>
-          <w:hyperlink w:anchor="_Toc241705387" w:history="1">
+          <w:hyperlink w:anchor="_Toc241705870" w:history="1">
             <w:r>
               <w:rPr>
                 <w:rStyle w:val="Hyperlink"/>
@@ -6664,7 +6664,7 @@
                 <w:noProof/>
                 <w:webHidden/>
               </w:rPr>
-              <w:instrText xml:space="preserve"> PAGEREF _Toc241705387 \h </w:instrText>
+              <w:instrText xml:space="preserve"> PAGEREF _Toc241705870 \h </w:instrText>
             </w:r>
             <w:r>
               <w:rPr>
@@ -6711,7 +6711,7 @@
               <w14:ligatures w14:val="standardContextual"/>
             </w:rPr>
           </w:pPr>
-          <w:hyperlink w:anchor="_Toc241705388" w:history="1">
+          <w:hyperlink w:anchor="_Toc241705871" w:history="1">
             <w:r>
               <w:rPr>
                 <w:rStyle w:val="Hyperlink"/>
@@ -6739,7 +6739,7 @@
                 <w:noProof/>
                 <w:webHidden/>
               </w:rPr>
-              <w:instrText xml:space="preserve"> PAGEREF _Toc241705388 \h </w:instrText>
+              <w:instrText xml:space="preserve"> PAGEREF _Toc241705871 \h </w:instrText>
             </w:r>
             <w:r>
               <w:rPr>
@@ -6786,7 +6786,7 @@
               <w14:ligatures w14:val="standardContextual"/>
             </w:rPr>
           </w:pPr>
-          <w:hyperlink w:anchor="_Toc241705389" w:history="1">
+          <w:hyperlink w:anchor="_Toc241705872" w:history="1">
             <w:r>
               <w:rPr>
                 <w:rStyle w:val="Hyperlink"/>
@@ -6814,7 +6814,7 @@
                 <w:noProof/>
                 <w:webHidden/>
               </w:rPr>
-              <w:instrText xml:space="preserve"> PAGEREF _Toc241705389 \h </w:instrText>
+              <w:instrText xml:space="preserve"> PAGEREF _Toc241705872 \h </w:instrText>
             </w:r>
             <w:r>
               <w:rPr>
@@ -6861,7 +6861,7 @@
               <w14:ligatures w14:val="standardContextual"/>
             </w:rPr>
           </w:pPr>
-          <w:hyperlink w:anchor="_Toc241705390" w:history="1">
+          <w:hyperlink w:anchor="_Toc241705873" w:history="1">
             <w:r>
               <w:rPr>
                 <w:rStyle w:val="Hyperlink"/>
@@ -6889,7 +6889,7 @@
                 <w:noProof/>
                 <w:webHidden/>
               </w:rPr>
-              <w:instrText xml:space="preserve"> PAGEREF _Toc241705390 \h </w:instrText>
+              <w:instrText xml:space="preserve"> PAGEREF _Toc241705873 \h </w:instrText>
             </w:r>
             <w:r>
               <w:rPr>
@@ -6948,7 +6948,7 @@
           <w:lang w:val="pt-BR"/>
         </w:rPr>
       </w:pPr>
-      <w:bookmarkStart w:id="0" w:name="_Toc241705315"/>
+      <w:bookmarkStart w:id="0" w:name="_Toc241705798"/>
       <w:r>
         <w:rPr>
           <w:lang w:val="pt-BR"/>
@@ -6966,7 +6966,7 @@
           <w:lang w:val="pt-BR"/>
         </w:rPr>
       </w:pPr>
-      <w:bookmarkStart w:id="1" w:name="_Toc241705316"/>
+      <w:bookmarkStart w:id="1" w:name="_Toc241705799"/>
       <w:r>
         <w:rPr>
           <w:lang w:val="pt-BR"/>
@@ -7031,7 +7031,7 @@
           <w:lang w:val="pt-BR"/>
         </w:rPr>
       </w:pPr>
-      <w:bookmarkStart w:id="2" w:name="_Toc241705317"/>
+      <w:bookmarkStart w:id="2" w:name="_Toc241705800"/>
       <w:r>
         <w:rPr>
           <w:lang w:val="pt-BR"/>
@@ -7064,7 +7064,7 @@
           <w:lang w:val="pt-BR"/>
         </w:rPr>
       </w:pPr>
-      <w:bookmarkStart w:id="3" w:name="_Toc241705318"/>
+      <w:bookmarkStart w:id="3" w:name="_Toc241705801"/>
       <w:r>
         <w:rPr>
           <w:lang w:val="pt-BR"/>
@@ -7120,7 +7120,7 @@
           <w:lang w:val="pt-BR"/>
         </w:rPr>
       </w:pPr>
-      <w:bookmarkStart w:id="4" w:name="_Toc241705319"/>
+      <w:bookmarkStart w:id="4" w:name="_Toc241705802"/>
       <w:r>
         <w:rPr>
           <w:lang w:val="pt-BR"/>
@@ -7169,7 +7169,7 @@
           <w:lang w:val="pt-BR"/>
         </w:rPr>
       </w:pPr>
-      <w:bookmarkStart w:id="5" w:name="_Toc241705320"/>
+      <w:bookmarkStart w:id="5" w:name="_Toc241705803"/>
       <w:r>
         <w:rPr>
           <w:lang w:val="pt-BR"/>
@@ -7235,7 +7235,7 @@
           <w:lang w:val="pt-BR"/>
         </w:rPr>
       </w:pPr>
-      <w:bookmarkStart w:id="6" w:name="_Toc241705321"/>
+      <w:bookmarkStart w:id="6" w:name="_Toc241705804"/>
       <w:r>
         <w:rPr>
           <w:lang w:val="pt-BR"/>
@@ -7317,7 +7317,7 @@
           <w:lang w:val="pt-BR"/>
         </w:rPr>
       </w:pPr>
-      <w:bookmarkStart w:id="7" w:name="_Toc241705322"/>
+      <w:bookmarkStart w:id="7" w:name="_Toc241705805"/>
       <w:r>
         <w:rPr>
           <w:lang w:val="pt-BR"/>
@@ -7432,7 +7432,7 @@
           <w:lang w:val="pt-BR"/>
         </w:rPr>
       </w:pPr>
-      <w:bookmarkStart w:id="8" w:name="_Toc241705323"/>
+      <w:bookmarkStart w:id="8" w:name="_Toc241705806"/>
       <w:r>
         <w:rPr>
           <w:lang w:val="pt-BR"/>
@@ -7449,7 +7449,7 @@
           <w:lang w:val="pt-BR"/>
         </w:rPr>
       </w:pPr>
-      <w:bookmarkStart w:id="9" w:name="_Toc241705324"/>
+      <w:bookmarkStart w:id="9" w:name="_Toc241705807"/>
       <w:r>
         <w:rPr>
           <w:lang w:val="pt-BR"/>
@@ -7483,7 +7483,7 @@
           <w:lang w:val="pt-BR"/>
         </w:rPr>
       </w:pPr>
-      <w:bookmarkStart w:id="10" w:name="_Toc241705325"/>
+      <w:bookmarkStart w:id="10" w:name="_Toc241705808"/>
       <w:r>
         <w:rPr>
           <w:lang w:val="pt-BR"/>
@@ -7703,7 +7703,7 @@
           <w:lang w:val="pt-BR"/>
         </w:rPr>
       </w:pPr>
-      <w:bookmarkStart w:id="11" w:name="_Toc241705326"/>
+      <w:bookmarkStart w:id="11" w:name="_Toc241705809"/>
       <w:r>
         <w:rPr>
           <w:lang w:val="pt-BR"/>
@@ -7817,7 +7817,7 @@
           <w:lang w:val="pt-BR"/>
         </w:rPr>
       </w:pPr>
-      <w:bookmarkStart w:id="12" w:name="_Toc241705327"/>
+      <w:bookmarkStart w:id="12" w:name="_Toc241705810"/>
       <w:r>
         <w:rPr>
           <w:lang w:val="pt-BR"/>
@@ -7874,7 +7874,7 @@
           <w:lang w:val="pt-BR"/>
         </w:rPr>
       </w:pPr>
-      <w:bookmarkStart w:id="13" w:name="_Toc241705328"/>
+      <w:bookmarkStart w:id="13" w:name="_Toc241705811"/>
       <w:r>
         <w:rPr>
           <w:lang w:val="pt-BR"/>
@@ -7892,7 +7892,7 @@
           <w:lang w:val="pt-BR"/>
         </w:rPr>
       </w:pPr>
-      <w:bookmarkStart w:id="14" w:name="_Toc241705329"/>
+      <w:bookmarkStart w:id="14" w:name="_Toc241705812"/>
       <w:r>
         <w:rPr>
           <w:lang w:val="pt-BR"/>
@@ -8012,7 +8012,7 @@
           <w:lang w:val="pt-BR"/>
         </w:rPr>
       </w:pPr>
-      <w:bookmarkStart w:id="15" w:name="_Toc241705330"/>
+      <w:bookmarkStart w:id="15" w:name="_Toc241705813"/>
       <w:r>
         <w:rPr>
           <w:lang w:val="pt-BR"/>
@@ -8171,7 +8171,7 @@
           <w:lang w:val="pt-BR"/>
         </w:rPr>
       </w:pPr>
-      <w:bookmarkStart w:id="16" w:name="_Toc241705331"/>
+      <w:bookmarkStart w:id="16" w:name="_Toc241705814"/>
       <w:r>
         <w:rPr>
           <w:lang w:val="pt-BR"/>
@@ -8863,7 +8863,7 @@
           <w:lang w:val="pt-BR"/>
         </w:rPr>
       </w:pPr>
-      <w:bookmarkStart w:id="17" w:name="_Toc241705332"/>
+      <w:bookmarkStart w:id="17" w:name="_Toc241705815"/>
       <w:r>
         <w:rPr>
           <w:lang w:val="pt-BR"/>
@@ -8945,7 +8945,7 @@
           <w:lang w:val="pt-BR"/>
         </w:rPr>
       </w:pPr>
-      <w:bookmarkStart w:id="18" w:name="_Toc241705333"/>
+      <w:bookmarkStart w:id="18" w:name="_Toc241705816"/>
       <w:r>
         <w:rPr>
           <w:lang w:val="pt-BR"/>
@@ -9088,7 +9088,7 @@
           <w:lang w:val="pt-BR"/>
         </w:rPr>
       </w:pPr>
-      <w:bookmarkStart w:id="19" w:name="_Toc241705334"/>
+      <w:bookmarkStart w:id="19" w:name="_Toc241705817"/>
       <w:r>
         <w:rPr>
           <w:lang w:val="pt-BR"/>
@@ -9192,7 +9192,7 @@
           <w:lang w:val="pt-BR"/>
         </w:rPr>
       </w:pPr>
-      <w:bookmarkStart w:id="20" w:name="_Toc241705335"/>
+      <w:bookmarkStart w:id="20" w:name="_Toc241705818"/>
       <w:r>
         <w:rPr>
           <w:lang w:val="pt-BR"/>
@@ -9280,7 +9280,7 @@
           <w:lang w:val="pt-BR"/>
         </w:rPr>
       </w:pPr>
-      <w:bookmarkStart w:id="21" w:name="_Toc241705336"/>
+      <w:bookmarkStart w:id="21" w:name="_Toc241705819"/>
       <w:r>
         <w:rPr>
           <w:lang w:val="pt-BR"/>
@@ -9423,7 +9423,7 @@
           <w:lang w:val="pt-BR"/>
         </w:rPr>
       </w:pPr>
-      <w:bookmarkStart w:id="22" w:name="_Toc241705337"/>
+      <w:bookmarkStart w:id="22" w:name="_Toc241705820"/>
       <w:r>
         <w:rPr>
           <w:lang w:val="pt-BR"/>
@@ -9543,7 +9543,7 @@
           <w:lang w:val="pt-BR"/>
         </w:rPr>
       </w:pPr>
-      <w:bookmarkStart w:id="23" w:name="_Toc241705338"/>
+      <w:bookmarkStart w:id="23" w:name="_Toc241705821"/>
       <w:r>
         <w:rPr>
           <w:lang w:val="pt-BR"/>
@@ -9649,7 +9649,7 @@
           <w:lang w:val="pt-BR"/>
         </w:rPr>
       </w:pPr>
-      <w:bookmarkStart w:id="24" w:name="_Toc241705339"/>
+      <w:bookmarkStart w:id="24" w:name="_Toc241705822"/>
       <w:r>
         <w:rPr>
           <w:lang w:val="pt-BR"/>
@@ -9667,7 +9667,7 @@
           <w:lang w:val="pt-BR"/>
         </w:rPr>
       </w:pPr>
-      <w:bookmarkStart w:id="25" w:name="_Toc241705340"/>
+      <w:bookmarkStart w:id="25" w:name="_Toc241705823"/>
       <w:r>
         <w:rPr>
           <w:lang w:val="pt-BR"/>
@@ -9700,7 +9700,7 @@
           <w:lang w:val="pt-BR"/>
         </w:rPr>
       </w:pPr>
-      <w:bookmarkStart w:id="26" w:name="_Toc241705341"/>
+      <w:bookmarkStart w:id="26" w:name="_Toc241705824"/>
       <w:r>
         <w:rPr>
           <w:lang w:val="pt-BR"/>
@@ -9923,7 +9923,7 @@
           <w:lang w:val="pt-BR"/>
         </w:rPr>
       </w:pPr>
-      <w:bookmarkStart w:id="27" w:name="_Toc241705342"/>
+      <w:bookmarkStart w:id="27" w:name="_Toc241705825"/>
       <w:r>
         <w:rPr>
           <w:lang w:val="pt-BR"/>
@@ -12076,7 +12076,7 @@
           <w:lang w:val="pt-BR"/>
         </w:rPr>
       </w:pPr>
-      <w:bookmarkStart w:id="28" w:name="_Toc241705343"/>
+      <w:bookmarkStart w:id="28" w:name="_Toc241705826"/>
       <w:r>
         <w:rPr>
           <w:lang w:val="pt-BR"/>
@@ -12742,7 +12742,7 @@
           <w:lang w:val="pt-BR"/>
         </w:rPr>
       </w:pPr>
-      <w:bookmarkStart w:id="29" w:name="_Toc241705344"/>
+      <w:bookmarkStart w:id="29" w:name="_Toc241705827"/>
       <w:r>
         <w:rPr>
           <w:lang w:val="pt-BR"/>
@@ -13466,7 +13466,7 @@
           <w:lang w:val="pt-BR"/>
         </w:rPr>
       </w:pPr>
-      <w:bookmarkStart w:id="30" w:name="_Toc241705345"/>
+      <w:bookmarkStart w:id="30" w:name="_Toc241705828"/>
       <w:r>
         <w:rPr>
           <w:lang w:val="pt-BR"/>
@@ -14294,7 +14294,7 @@
           <w:lang w:val="pt-BR"/>
         </w:rPr>
       </w:pPr>
-      <w:bookmarkStart w:id="31" w:name="_Toc241705346"/>
+      <w:bookmarkStart w:id="31" w:name="_Toc241705829"/>
       <w:r>
         <w:rPr>
           <w:lang w:val="pt-BR"/>
@@ -14356,7 +14356,7 @@
           <w:lang w:val="pt-BR"/>
         </w:rPr>
       </w:pPr>
-      <w:bookmarkStart w:id="32" w:name="_Toc241705347"/>
+      <w:bookmarkStart w:id="32" w:name="_Toc241705830"/>
       <w:r>
         <w:rPr>
           <w:lang w:val="pt-BR"/>
@@ -14512,7 +14512,7 @@
           <w:lang w:val="pt-BR"/>
         </w:rPr>
       </w:pPr>
-      <w:bookmarkStart w:id="33" w:name="_Toc241705348"/>
+      <w:bookmarkStart w:id="33" w:name="_Toc241705831"/>
       <w:r>
         <w:rPr>
           <w:lang w:val="pt-BR"/>
@@ -14636,7 +14636,7 @@
           <w:lang w:val="pt-BR"/>
         </w:rPr>
       </w:pPr>
-      <w:bookmarkStart w:id="34" w:name="_Toc241705349"/>
+      <w:bookmarkStart w:id="34" w:name="_Toc241705832"/>
       <w:r>
         <w:rPr>
           <w:lang w:val="pt-BR"/>
@@ -14650,7 +14650,7 @@
         <w:pStyle w:val="Heading3"/>
         <w:spacing w:before="320" w:after="200" w:line="360" w:lineRule="auto"/>
       </w:pPr>
-      <w:bookmarkStart w:id="35" w:name="_Toc241705350"/>
+      <w:bookmarkStart w:id="35" w:name="_Toc241705833"/>
       <w:r>
         <w:rPr>
           <w:lang w:val="pt-BR"/>
@@ -14764,7 +14764,7 @@
         <w:pStyle w:val="Heading3"/>
         <w:spacing w:before="320" w:after="200" w:line="360" w:lineRule="auto"/>
       </w:pPr>
-      <w:bookmarkStart w:id="36" w:name="_Toc241705351"/>
+      <w:bookmarkStart w:id="36" w:name="_Toc241705834"/>
       <w:r>
         <w:rPr>
           <w:lang w:val="pt-BR"/>
@@ -14893,7 +14893,7 @@
           <w:lang w:val="pt-BR"/>
         </w:rPr>
       </w:pPr>
-      <w:bookmarkStart w:id="37" w:name="_Toc241705352"/>
+      <w:bookmarkStart w:id="37" w:name="_Toc241705835"/>
       <w:r>
         <w:rPr>
           <w:lang w:val="pt-BR"/>
@@ -15047,7 +15047,7 @@
           <w:lang w:val="pt-BR"/>
         </w:rPr>
       </w:pPr>
-      <w:bookmarkStart w:id="38" w:name="_Toc241705353"/>
+      <w:bookmarkStart w:id="38" w:name="_Toc241705836"/>
       <w:r>
         <w:rPr>
           <w:lang w:val="pt-BR"/>
@@ -15840,7 +15840,7 @@
           <w:lang w:val="pt-BR"/>
         </w:rPr>
       </w:pPr>
-      <w:bookmarkStart w:id="39" w:name="_Toc241705354"/>
+      <w:bookmarkStart w:id="39" w:name="_Toc241705837"/>
       <w:r>
         <w:rPr>
           <w:lang w:val="pt-BR"/>
@@ -16389,7 +16389,7 @@
           <w:lang w:val="pt-BR"/>
         </w:rPr>
       </w:pPr>
-      <w:bookmarkStart w:id="40" w:name="_Toc241705355"/>
+      <w:bookmarkStart w:id="40" w:name="_Toc241705838"/>
       <w:r>
         <w:rPr>
           <w:lang w:val="pt-BR"/>
@@ -16615,7 +16615,7 @@
           <w:lang w:val="pt-BR"/>
         </w:rPr>
       </w:pPr>
-      <w:bookmarkStart w:id="41" w:name="_Toc241705356"/>
+      <w:bookmarkStart w:id="41" w:name="_Toc241705839"/>
       <w:r>
         <w:rPr>
           <w:lang w:val="pt-BR"/>
@@ -16783,7 +16783,7 @@
           <w:lang w:val="pt-BR"/>
         </w:rPr>
       </w:pPr>
-      <w:bookmarkStart w:id="42" w:name="_Toc241705357"/>
+      <w:bookmarkStart w:id="42" w:name="_Toc241705840"/>
       <w:r>
         <w:rPr>
           <w:lang w:val="pt-BR"/>
@@ -17451,7 +17451,7 @@
           <w:lang w:val="pt-BR"/>
         </w:rPr>
       </w:pPr>
-      <w:bookmarkStart w:id="43" w:name="_Toc241705358"/>
+      <w:bookmarkStart w:id="43" w:name="_Toc241705841"/>
       <w:r>
         <w:rPr>
           <w:lang w:val="pt-BR"/>
@@ -17485,7 +17485,7 @@
           <w:lang w:val="pt-BR"/>
         </w:rPr>
       </w:pPr>
-      <w:bookmarkStart w:id="44" w:name="_Toc241705359"/>
+      <w:bookmarkStart w:id="44" w:name="_Toc241705842"/>
       <w:r>
         <w:rPr>
           <w:lang w:val="pt-BR"/>
@@ -17519,7 +17519,7 @@
           <w:lang w:val="pt-BR"/>
         </w:rPr>
       </w:pPr>
-      <w:bookmarkStart w:id="45" w:name="_Toc241705360"/>
+      <w:bookmarkStart w:id="45" w:name="_Toc241705843"/>
       <w:r>
         <w:rPr>
           <w:lang w:val="pt-BR"/>
@@ -17553,7 +17553,7 @@
           <w:lang w:val="pt-BR"/>
         </w:rPr>
       </w:pPr>
-      <w:bookmarkStart w:id="46" w:name="_Toc241705361"/>
+      <w:bookmarkStart w:id="46" w:name="_Toc241705844"/>
       <w:r>
         <w:rPr>
           <w:lang w:val="pt-BR"/>
@@ -18533,7 +18533,7 @@
           <w:lang w:val="pt-BR"/>
         </w:rPr>
       </w:pPr>
-      <w:bookmarkStart w:id="47" w:name="_Toc241705362"/>
+      <w:bookmarkStart w:id="47" w:name="_Toc241705845"/>
       <w:r>
         <w:rPr>
           <w:lang w:val="pt-BR"/>
@@ -19583,7 +19583,7 @@
           <w:lang w:val="pt-BR"/>
         </w:rPr>
       </w:pPr>
-      <w:bookmarkStart w:id="48" w:name="_Toc241705363"/>
+      <w:bookmarkStart w:id="48" w:name="_Toc241705846"/>
       <w:r>
         <w:rPr>
           <w:lang w:val="pt-BR"/>
@@ -19618,7 +19618,7 @@
           <w:lang w:val="pt-BR"/>
         </w:rPr>
       </w:pPr>
-      <w:bookmarkStart w:id="49" w:name="_Toc241705364"/>
+      <w:bookmarkStart w:id="49" w:name="_Toc241705847"/>
       <w:r>
         <w:rPr>
           <w:lang w:val="pt-BR"/>
@@ -21166,7 +21166,7 @@
           <w:lang w:val="pt-BR"/>
         </w:rPr>
       </w:pPr>
-      <w:bookmarkStart w:id="50" w:name="_Toc241705365"/>
+      <w:bookmarkStart w:id="50" w:name="_Toc241705848"/>
       <w:r>
         <w:rPr>
           <w:lang w:val="pt-BR"/>
@@ -21339,7 +21339,7 @@
           <w:lang w:val="pt-BR"/>
         </w:rPr>
       </w:pPr>
-      <w:bookmarkStart w:id="51" w:name="_Toc241705366"/>
+      <w:bookmarkStart w:id="51" w:name="_Toc241705849"/>
       <w:r>
         <w:rPr>
           <w:lang w:val="pt-BR"/>
@@ -22357,7 +22357,7 @@
           <w:lang w:val="pt-BR"/>
         </w:rPr>
       </w:pPr>
-      <w:bookmarkStart w:id="52" w:name="_Toc241705367"/>
+      <w:bookmarkStart w:id="52" w:name="_Toc241705850"/>
       <w:r>
         <w:rPr>
           <w:lang w:val="pt-BR"/>
@@ -22374,7 +22374,7 @@
           <w:lang w:val="pt-BR"/>
         </w:rPr>
       </w:pPr>
-      <w:bookmarkStart w:id="53" w:name="_Toc241705368"/>
+      <w:bookmarkStart w:id="53" w:name="_Toc241705851"/>
       <w:r>
         <w:rPr>
           <w:lang w:val="pt-BR"/>
@@ -23591,7 +23591,7 @@
           <w:lang w:val="pt-BR"/>
         </w:rPr>
       </w:pPr>
-      <w:bookmarkStart w:id="54" w:name="_Toc241705369"/>
+      <w:bookmarkStart w:id="54" w:name="_Toc241705852"/>
       <w:r>
         <w:rPr>
           <w:lang w:val="pt-BR"/>
@@ -23762,7 +23762,7 @@
           <w:lang w:val="pt-BR"/>
         </w:rPr>
       </w:pPr>
-      <w:bookmarkStart w:id="55" w:name="_Toc241705370"/>
+      <w:bookmarkStart w:id="55" w:name="_Toc241705853"/>
       <w:r>
         <w:rPr>
           <w:lang w:val="pt-BR"/>
@@ -24899,7 +24899,7 @@
           <w:lang w:val="pt-BR"/>
         </w:rPr>
       </w:pPr>
-      <w:bookmarkStart w:id="56" w:name="_Toc241705371"/>
+      <w:bookmarkStart w:id="56" w:name="_Toc241705854"/>
       <w:r>
         <w:rPr>
           <w:lang w:val="pt-BR"/>
@@ -26772,7 +26772,7 @@
           <w:lang w:val="pt-BR"/>
         </w:rPr>
       </w:pPr>
-      <w:bookmarkStart w:id="57" w:name="_Toc241705372"/>
+      <w:bookmarkStart w:id="57" w:name="_Toc241705855"/>
       <w:r>
         <w:rPr>
           <w:lang w:val="pt-BR"/>
@@ -26806,7 +26806,7 @@
           <w:lang w:val="pt-BR"/>
         </w:rPr>
       </w:pPr>
-      <w:bookmarkStart w:id="58" w:name="_Toc241705373"/>
+      <w:bookmarkStart w:id="58" w:name="_Toc241705856"/>
       <w:r>
         <w:rPr>
           <w:lang w:val="pt-BR"/>
@@ -26841,7 +26841,7 @@
           <w:lang w:val="pt-BR"/>
         </w:rPr>
       </w:pPr>
-      <w:bookmarkStart w:id="59" w:name="_Toc241705374"/>
+      <w:bookmarkStart w:id="59" w:name="_Toc241705857"/>
       <w:r>
         <w:rPr>
           <w:lang w:val="pt-BR"/>
@@ -26876,7 +26876,7 @@
           <w:lang w:val="pt-BR"/>
         </w:rPr>
       </w:pPr>
-      <w:bookmarkStart w:id="60" w:name="_Toc241705375"/>
+      <w:bookmarkStart w:id="60" w:name="_Toc241705858"/>
       <w:r>
         <w:rPr>
           <w:lang w:val="pt-BR"/>
@@ -26924,7 +26924,7 @@
           <w:lang w:val="pt-BR"/>
         </w:rPr>
       </w:pPr>
-      <w:bookmarkStart w:id="61" w:name="_Toc241705376"/>
+      <w:bookmarkStart w:id="61" w:name="_Toc241705859"/>
       <w:r>
         <w:rPr>
           <w:lang w:val="pt-BR"/>
@@ -26958,7 +26958,7 @@
           <w:lang w:val="pt-BR"/>
         </w:rPr>
       </w:pPr>
-      <w:bookmarkStart w:id="62" w:name="_Toc241705377"/>
+      <w:bookmarkStart w:id="62" w:name="_Toc241705860"/>
       <w:r>
         <w:rPr>
           <w:lang w:val="pt-BR"/>
@@ -26993,7 +26993,7 @@
           <w:lang w:val="pt-BR"/>
         </w:rPr>
       </w:pPr>
-      <w:bookmarkStart w:id="63" w:name="_Toc241705378"/>
+      <w:bookmarkStart w:id="63" w:name="_Toc241705861"/>
       <w:r>
         <w:rPr>
           <w:lang w:val="pt-BR"/>
@@ -27543,7 +27543,7 @@
           <w:lang w:val="pt-BR"/>
         </w:rPr>
       </w:pPr>
-      <w:bookmarkStart w:id="64" w:name="_Toc241705379"/>
+      <w:bookmarkStart w:id="64" w:name="_Toc241705862"/>
       <w:r>
         <w:rPr>
           <w:lang w:val="pt-BR"/>
@@ -27574,7 +27574,7 @@
         <w:pStyle w:val="Heading2"/>
         <w:spacing w:before="360" w:after="240" w:line="360" w:lineRule="auto"/>
       </w:pPr>
-      <w:bookmarkStart w:id="65" w:name="_Toc241705380"/>
+      <w:bookmarkStart w:id="65" w:name="_Toc241705863"/>
       <w:r>
         <w:rPr>
           <w:lang w:val="pt-BR"/>
@@ -28533,7 +28533,7 @@
           <w:lang w:val="pt-BR"/>
         </w:rPr>
       </w:pPr>
-      <w:bookmarkStart w:id="66" w:name="_Toc241705381"/>
+      <w:bookmarkStart w:id="66" w:name="_Toc241705864"/>
       <w:r>
         <w:rPr>
           <w:lang w:val="pt-BR"/>
@@ -28551,7 +28551,7 @@
           <w:lang w:val="pt-BR"/>
         </w:rPr>
       </w:pPr>
-      <w:bookmarkStart w:id="67" w:name="_Toc241705382"/>
+      <w:bookmarkStart w:id="67" w:name="_Toc241705865"/>
       <w:r>
         <w:rPr>
           <w:lang w:val="pt-BR"/>
@@ -28585,7 +28585,7 @@
           <w:lang w:val="pt-BR"/>
         </w:rPr>
       </w:pPr>
-      <w:bookmarkStart w:id="68" w:name="_Toc241705383"/>
+      <w:bookmarkStart w:id="68" w:name="_Toc241705866"/>
       <w:r>
         <w:rPr>
           <w:lang w:val="pt-BR"/>
@@ -28619,7 +28619,7 @@
           <w:lang w:val="pt-BR"/>
         </w:rPr>
       </w:pPr>
-      <w:bookmarkStart w:id="69" w:name="_Toc241705384"/>
+      <w:bookmarkStart w:id="69" w:name="_Toc241705867"/>
       <w:r>
         <w:rPr>
           <w:lang w:val="pt-BR"/>
@@ -29197,7 +29197,7 @@
           <w:lang w:val="pt-BR"/>
         </w:rPr>
       </w:pPr>
-      <w:bookmarkStart w:id="70" w:name="_Toc241705385"/>
+      <w:bookmarkStart w:id="70" w:name="_Toc241705868"/>
       <w:r>
         <w:rPr>
           <w:lang w:val="pt-BR"/>
@@ -29233,7 +29233,7 @@
           <w:lang w:val="pt-BR"/>
         </w:rPr>
       </w:pPr>
-      <w:bookmarkStart w:id="71" w:name="_Toc241705386"/>
+      <w:bookmarkStart w:id="71" w:name="_Toc241705869"/>
       <w:r>
         <w:rPr>
           <w:lang w:val="pt-BR"/>
@@ -29268,7 +29268,7 @@
           <w:lang w:val="pt-BR"/>
         </w:rPr>
       </w:pPr>
-      <w:bookmarkStart w:id="72" w:name="_Toc241705387"/>
+      <w:bookmarkStart w:id="72" w:name="_Toc241705870"/>
       <w:r>
         <w:rPr>
           <w:lang w:val="pt-BR"/>
@@ -29518,7 +29518,7 @@
           <w:lang w:val="pt-BR"/>
         </w:rPr>
       </w:pPr>
-      <w:bookmarkStart w:id="73" w:name="_Toc241705388"/>
+      <w:bookmarkStart w:id="73" w:name="_Toc241705871"/>
       <w:r>
         <w:rPr>
           <w:lang w:val="pt-BR"/>
@@ -30803,7 +30803,7 @@
           <w:lang w:val="pt-BR"/>
         </w:rPr>
       </w:pPr>
-      <w:bookmarkStart w:id="74" w:name="_Toc241705389"/>
+      <w:bookmarkStart w:id="74" w:name="_Toc241705872"/>
       <w:r>
         <w:rPr>
           <w:lang w:val="pt-BR"/>
@@ -31170,7 +31170,7 @@
                 <w:sz w:val="20"/>
                 <w:szCs w:val="20"/>
               </w:rPr>
-              <w:t>Claude Opus 5 (Anthropic)</w:t>
+              <w:t>Claude Opus 5 e Claude Opus 5.5 (Anthropic)</w:t>
             </w:r>
           </w:p>
         </w:tc>
@@ -31196,7 +31196,7 @@
                 <w:szCs w:val="20"/>
                 <w:lang w:val="pt-BR"/>
               </w:rPr>
-              <w:t>claude-opus-5, modo de esforço estendido</w:t>
+              <w:t>claude-opus-5 e claude-opus-5-5, modo de esforço estendido</w:t>
             </w:r>
           </w:p>
         </w:tc>
@@ -31284,7 +31284,7 @@
                 <w:sz w:val="20"/>
                 <w:szCs w:val="20"/>
               </w:rPr>
-              <w:t>Claude Opus 5 (Anthropic)</w:t>
+              <w:t>Claude Opus 5 e Claude Opus 5.5 (Anthropic)</w:t>
             </w:r>
           </w:p>
         </w:tc>
@@ -31310,7 +31310,7 @@
                 <w:szCs w:val="20"/>
                 <w:lang w:val="pt-BR"/>
               </w:rPr>
-              <w:t xml:space="preserve">claude-opus-5, modo de </w:t>
+              <w:t xml:space="preserve">claude-opus-5 e claude-opus-5-5, </w:t>
             </w:r>
             <w:r>
               <w:rPr>
@@ -31319,7 +31319,7 @@
                 <w:lang w:val="pt-BR"/>
               </w:rPr>
               <w:lastRenderedPageBreak/>
-              <w:t>esforço estendido</w:t>
+              <w:t>modo de esforço estendido</w:t>
             </w:r>
           </w:p>
         </w:tc>
@@ -31418,7 +31418,7 @@
                 <w:sz w:val="20"/>
                 <w:szCs w:val="20"/>
               </w:rPr>
-              <w:t>Claude Opus 5 (Anthropic)</w:t>
+              <w:t>Claude Opus 5 e Claude Opus 5.5 (Anthropic)</w:t>
             </w:r>
           </w:p>
         </w:tc>
@@ -31444,7 +31444,7 @@
                 <w:szCs w:val="20"/>
                 <w:lang w:val="pt-BR"/>
               </w:rPr>
-              <w:t>claude-opus-5, modo de esforço estendido</w:t>
+              <w:t>claude-opus-5 e claude-opus-5-5, modo de esforço estendido</w:t>
             </w:r>
           </w:p>
         </w:tc>
@@ -31532,7 +31532,7 @@
                 <w:sz w:val="20"/>
                 <w:szCs w:val="20"/>
               </w:rPr>
-              <w:t>Claude Opus 5 (Anthropic)</w:t>
+              <w:t>Claude Opus 5 e Claude Opus 5.5 (Anthropic)</w:t>
             </w:r>
           </w:p>
         </w:tc>
@@ -31558,7 +31558,7 @@
                 <w:szCs w:val="20"/>
                 <w:lang w:val="pt-BR"/>
               </w:rPr>
-              <w:t>claude-opus-5, modo de esforço estendido</w:t>
+              <w:t>claude-opus-5 e claude-opus-5-5, modo de esforço estendido</w:t>
             </w:r>
           </w:p>
         </w:tc>
@@ -31646,7 +31646,7 @@
                 <w:sz w:val="20"/>
                 <w:szCs w:val="20"/>
               </w:rPr>
-              <w:t>Claude Opus 5 (Anthropic)</w:t>
+              <w:t>Claude Opus 5 e Claude Opus 5.5 (Anthropic)</w:t>
             </w:r>
           </w:p>
         </w:tc>
@@ -31672,7 +31672,7 @@
                 <w:szCs w:val="20"/>
                 <w:lang w:val="pt-BR"/>
               </w:rPr>
-              <w:t>claude-opus-5, modo de esforço estendido</w:t>
+              <w:t>claude-opus-5 e claude-opus-5-5, modo de esforço estendido</w:t>
             </w:r>
           </w:p>
         </w:tc>
@@ -31760,7 +31760,7 @@
                 <w:sz w:val="20"/>
                 <w:szCs w:val="20"/>
               </w:rPr>
-              <w:t>Claude Opus 5.5 (Anthropic)</w:t>
+              <w:t>Claude Opus 5 e Claude Opus 5.5 (Anthropic)</w:t>
             </w:r>
           </w:p>
         </w:tc>
@@ -31781,7 +31781,7 @@
                 <w:szCs w:val="20"/>
                 <w:lang w:val="pt-BR"/>
               </w:rPr>
-              <w:t>claude-opus-5-5, pela ferramenta Claude Code</w:t>
+              <w:t>claude-opus-5 e claude-opus-5-5, pela ferramenta Claude Code</w:t>
             </w:r>
           </w:p>
         </w:tc>
@@ -31864,7 +31864,7 @@
                 <w:sz w:val="20"/>
                 <w:szCs w:val="20"/>
               </w:rPr>
-              <w:t>Claude Opus 5.5 (Anthropic)</w:t>
+              <w:t>Claude Opus 5 e Claude Opus 5.5 (Anthropic)</w:t>
             </w:r>
           </w:p>
         </w:tc>
@@ -31885,7 +31885,7 @@
                 <w:szCs w:val="20"/>
                 <w:lang w:val="pt-BR"/>
               </w:rPr>
-              <w:t>claude-opus-5-5, pela ferramenta Claude Code</w:t>
+              <w:t>claude-opus-5 e claude-opus-5-5, pela ferramenta Claude Code</w:t>
             </w:r>
           </w:p>
         </w:tc>
@@ -31980,14 +31980,14 @@
         <w:rPr>
           <w:lang w:val="pt-BR"/>
         </w:rPr>
-        <w:t xml:space="preserve">Ambiente de acesso e janela temporal de interação. As requisições ao modelo Claude Opus 5 foram executadas pela interface do aplicativo Claude, com execução de código em ambiente isolado fornecido pela própria ferramenta, e pela ferramenta </w:t>
+        <w:t xml:space="preserve">Ambiente de acesso e janela temporal de interação. As requisições aos modelos Claude Opus 5 e Claude Opus 5.5 foram executadas pela interface do aplicativo Claude, com execução de código em ambiente isolado fornecido pela própria </w:t>
       </w:r>
       <w:r>
         <w:rPr>
           <w:lang w:val="pt-BR"/>
         </w:rPr>
         <w:lastRenderedPageBreak/>
-        <w:t xml:space="preserve">Claude Code, com execução de código no computador dos autores, no período de ___/___/2026 a ___/___/2026. </w:t>
+        <w:t xml:space="preserve">ferramenta, e pela ferramenta Claude Code, com execução de código no computador dos autores, no período de ___/___/2026 a ___/___/2026. </w:t>
       </w:r>
     </w:p>
     <w:p>
@@ -32306,7 +32306,7 @@
         <w:spacing w:before="480" w:after="280" w:line="360" w:lineRule="auto"/>
         <w:jc w:val="center"/>
       </w:pPr>
-      <w:bookmarkStart w:id="75" w:name="_Toc241705390"/>
+      <w:bookmarkStart w:id="75" w:name="_Toc241705873"/>
       <w:r>
         <w:rPr>
           <w:lang w:val="pt-BR"/>

</xml_diff>